<commit_message>
update geographic Location debug with 2026.06.0
</commit_message>
<xml_diff>
--- a/docs/ZRADTechDocs.docx
+++ b/docs/ZRADTechDocs.docx
@@ -1,6 +1,6 @@
 
 <file path=word/document.xml><?xml version="1.0" encoding="utf-8"?>
-<w:document xmlns:wpc="http://schemas.microsoft.com/office/word/2010/wordprocessingCanvas" xmlns:cx="http://schemas.microsoft.com/office/drawing/2014/chartex" xmlns:cx1="http://schemas.microsoft.com/office/drawing/2015/9/8/chartex" xmlns:cx2="http://schemas.microsoft.com/office/drawing/2015/10/21/chartex" xmlns:cx3="http://schemas.microsoft.com/office/drawing/2016/5/9/chartex" xmlns:cx4="http://schemas.microsoft.com/office/drawing/2016/5/10/chartex" xmlns:cx5="http://schemas.microsoft.com/office/drawing/2016/5/11/chartex" xmlns:cx6="http://schemas.microsoft.com/office/drawing/2016/5/12/chartex" xmlns:cx7="http://schemas.microsoft.com/office/drawing/2016/5/13/chartex" xmlns:cx8="http://schemas.microsoft.com/office/drawing/2016/5/14/chartex" xmlns:mc="http://schemas.openxmlformats.org/markup-compatibility/2006" xmlns:aink="http://schemas.microsoft.com/office/drawing/2016/ink" xmlns:am3d="http://schemas.microsoft.com/office/drawing/2017/model3d" xmlns:o="urn:schemas-microsoft-com:office:office" xmlns:oel="http://schemas.microsoft.com/office/2019/extlst" xmlns:r="http://schemas.openxmlformats.org/officeDocument/2006/relationships" xmlns:m="http://schemas.openxmlformats.org/officeDocument/2006/math" xmlns:v="urn:schemas-microsoft-com:vml" xmlns:wp14="http://schemas.microsoft.com/office/word/2010/wordprocessingDrawing" xmlns:wp="http://schemas.openxmlformats.org/drawingml/2006/wordprocessingDrawing" xmlns:w10="urn:schemas-microsoft-com:office:word" xmlns:w="http://schemas.openxmlformats.org/wordprocessingml/2006/main" xmlns:w14="http://schemas.microsoft.com/office/word/2010/wordml" xmlns:w15="http://schemas.microsoft.com/office/word/2012/wordml" xmlns:w16cex="http://schemas.microsoft.com/office/word/2018/wordml/cex" xmlns:w16cid="http://schemas.microsoft.com/office/word/2016/wordml/cid" xmlns:w16="http://schemas.microsoft.com/office/word/2018/wordml" xmlns:w16du="http://schemas.microsoft.com/office/word/2023/wordml/word16du" xmlns:w16sdtdh="http://schemas.microsoft.com/office/word/2020/wordml/sdtdatahash" xmlns:w16sdtfl="http://schemas.microsoft.com/office/word/2024/wordml/sdtformatlock" xmlns:w16se="http://schemas.microsoft.com/office/word/2015/wordml/symex" xmlns:wpg="http://schemas.microsoft.com/office/word/2010/wordprocessingGroup" xmlns:wpi="http://schemas.microsoft.com/office/word/2010/wordprocessingInk" xmlns:wne="http://schemas.microsoft.com/office/word/2006/wordml" xmlns:wps="http://schemas.microsoft.com/office/word/2010/wordprocessingShape" mc:Ignorable="w14 w15 w16se w16cid w16 w16cex w16sdtdh w16sdtfl w16du wp14">
+<w:document xmlns:wpc="http://schemas.microsoft.com/office/word/2010/wordprocessingCanvas" xmlns:cx="http://schemas.microsoft.com/office/drawing/2014/chartex" xmlns:cx1="http://schemas.microsoft.com/office/drawing/2015/9/8/chartex" xmlns:cx2="http://schemas.microsoft.com/office/drawing/2015/10/21/chartex" xmlns:cx3="http://schemas.microsoft.com/office/drawing/2016/5/9/chartex" xmlns:cx4="http://schemas.microsoft.com/office/drawing/2016/5/10/chartex" xmlns:cx5="http://schemas.microsoft.com/office/drawing/2016/5/11/chartex" xmlns:cx6="http://schemas.microsoft.com/office/drawing/2016/5/12/chartex" xmlns:cx7="http://schemas.microsoft.com/office/drawing/2016/5/13/chartex" xmlns:cx8="http://schemas.microsoft.com/office/drawing/2016/5/14/chartex" xmlns:mc="http://schemas.openxmlformats.org/markup-compatibility/2006" xmlns:aink="http://schemas.microsoft.com/office/drawing/2016/ink" xmlns:am3d="http://schemas.microsoft.com/office/drawing/2017/model3d" xmlns:o="urn:schemas-microsoft-com:office:office" xmlns:oel="http://schemas.microsoft.com/office/2019/extlst" xmlns:r="http://schemas.openxmlformats.org/officeDocument/2006/relationships" xmlns:m="http://schemas.openxmlformats.org/officeDocument/2006/math" xmlns:v="urn:schemas-microsoft-com:vml" xmlns:wp14="http://schemas.microsoft.com/office/word/2010/wordprocessingDrawing" xmlns:wp="http://schemas.openxmlformats.org/drawingml/2006/wordprocessingDrawing" xmlns:w10="urn:schemas-microsoft-com:office:word" xmlns:w="http://schemas.openxmlformats.org/wordprocessingml/2006/main" xmlns:w14="http://schemas.microsoft.com/office/word/2010/wordml" xmlns:w15="http://schemas.microsoft.com/office/word/2012/wordml" xmlns:w16cei="http://schemas.microsoft.com/office/word/2026/wordml/cei" xmlns:w16cex="http://schemas.microsoft.com/office/word/2018/wordml/cex" xmlns:w16cid="http://schemas.microsoft.com/office/word/2016/wordml/cid" xmlns:w16="http://schemas.microsoft.com/office/word/2018/wordml" xmlns:w16du="http://schemas.microsoft.com/office/word/2023/wordml/word16du" xmlns:w16sdtdh="http://schemas.microsoft.com/office/word/2020/wordml/sdtdatahash" xmlns:w16sdtfl="http://schemas.microsoft.com/office/word/2024/wordml/sdtformatlock" xmlns:w16se="http://schemas.microsoft.com/office/word/2015/wordml/symex" xmlns:wpg="http://schemas.microsoft.com/office/word/2010/wordprocessingGroup" xmlns:wpi="http://schemas.microsoft.com/office/word/2010/wordprocessingInk" xmlns:wne="http://schemas.microsoft.com/office/word/2006/wordml" xmlns:wps="http://schemas.microsoft.com/office/word/2010/wordprocessingShape" mc:Ignorable="w14 w15 w16se w16cid w16 w16cex w16sdtdh w16sdtfl w16du wp14">
   <w:body>
     <w:p>
       <w:pPr>
@@ -1052,13 +1052,7 @@
     </w:p>
     <w:p>
       <w:r>
-        <w:t>Z-Wave Log (</w:t>
-      </w:r>
-      <w:r>
-        <w:t xml:space="preserve">formerly DEBUGPRINT) </w:t>
-      </w:r>
-      <w:r>
-        <w:t>is a generic silabs utility to</w:t>
+        <w:t>Z-Wave Log (formerly DEBUGPRINT) is a generic silabs utility to</w:t>
       </w:r>
       <w:r>
         <w:t xml:space="preserve"> print messages via the MiniSimplicity headers VCOM pins. Typically</w:t>
@@ -4512,6 +4506,18 @@
             <w:r>
               <w:t>Working</w:t>
             </w:r>
+            <w:r>
+              <w:t>, GeoLoc</w:t>
+            </w:r>
+          </w:p>
+          <w:p>
+            <w:pPr>
+              <w:keepNext/>
+              <w:keepLines/>
+            </w:pPr>
+            <w:r>
+              <w:t>Buzzer installed</w:t>
+            </w:r>
           </w:p>
         </w:tc>
         <w:tc>
@@ -6589,6 +6595,42 @@
         <w:pStyle w:val="Heading2"/>
       </w:pPr>
       <w:r>
+        <w:t>2026-07-29 – GeoLoc working</w:t>
+      </w:r>
+    </w:p>
+    <w:p>
+      <w:r>
+        <w:t xml:space="preserve">Took several </w:t>
+      </w:r>
+      <w:r>
+        <w:t xml:space="preserve">silabs </w:t>
+      </w:r>
+      <w:r>
+        <w:t>cases to get GeoLoc working. The buzzer doesn’t work yet but I installed the code in a #ifdef in CC-GeographicLoc.c. Boards 7 and 8 are working.</w:t>
+      </w:r>
+    </w:p>
+    <w:p>
+      <w:r>
+        <w:t>I can’t get the buzzer to sound. I put the code in the CC_GeographicLoc.c file instead of being in the SDK code. Do I need to enable the GPIO? The PD02 pin is always low and the PD00 is high which seems like PD00 must be driving it high</w:t>
+      </w:r>
+      <w:r>
+        <w:t>? Tracking thru the code with Ozone, ApplicationTask has Timer0 setup but not with my settings. Later the init routine in CC-Geographic.c is called. Because I can’t turn on debug (it won’t compile) Ozone is unable to track thru the code that should be setting Timer0 but it remains incorrect.</w:t>
+      </w:r>
+      <w:r>
+        <w:t xml:space="preserve"> GPIO.TIMER0_ROUTEEN.CC0PEN needs to be 1.</w:t>
+      </w:r>
+      <w:r>
+        <w:t xml:space="preserve"> Frequency is right on 2.73khz. For some reason the audio is running all the time. Added a STOP after initializing. Now it doesn’t stop once I send a geoGET so the interrupt is not firing I assume. Timer0 OF and CC0 interrupts are 1 but we’re not taking the interrupt because the CC0 interrupt is not enabled.</w:t>
+      </w:r>
+      <w:r>
+        <w:t xml:space="preserve"> Added the enables and now it works!</w:t>
+      </w:r>
+    </w:p>
+    <w:p>
+      <w:pPr>
+        <w:pStyle w:val="Heading2"/>
+      </w:pPr>
+      <w:r>
         <w:t>2026-07-24 – Updated GeoLocCC to 2026.06.0</w:t>
       </w:r>
     </w:p>
@@ -6633,6 +6675,9 @@
     </w:p>
     <w:p>
       <w:r>
+        <w:rPr>
+          <w:noProof/>
+        </w:rPr>
         <w:drawing>
           <wp:anchor distT="0" distB="0" distL="114300" distR="114300" simplePos="0" relativeHeight="251714560" behindDoc="0" locked="0" layoutInCell="1" allowOverlap="1" wp14:anchorId="7759AEFE" wp14:editId="797614EE">
             <wp:simplePos x="457200" y="2533650"/>
@@ -6722,7 +6767,11 @@
         <w:t>D</w:t>
       </w:r>
       <w:r>
-        <w:t>s that were the correct pinout? The QLP has been in ZRADminis BOM since it was first checked in.</w:t>
+        <w:t xml:space="preserve">s that were the correct pinout? The QLP has been in ZRADminis BOM since it was first </w:t>
+      </w:r>
+      <w:r>
+        <w:lastRenderedPageBreak/>
+        <w:t>checked in.</w:t>
       </w:r>
       <w:r>
         <w:t xml:space="preserve"> I tested the LED itself and the pin with the notch is NOT the common anode. It’s the pin across from it. I applied 3v to that pin and grounded the other pins and the proper color led comes on. </w:t>
@@ -6747,7 +6796,6 @@
         <w:pStyle w:val="Heading2"/>
       </w:pPr>
       <w:r>
-        <w:lastRenderedPageBreak/>
         <w:t>2026-07-24 – Built ZRADmini boards 7&amp;8</w:t>
       </w:r>
     </w:p>
@@ -6919,7 +6967,11 @@
         <w:t xml:space="preserve">7.24 2025.6.2 </w:t>
       </w:r>
       <w:r>
-        <w:t>is 37.97mA. The easy way to see the frame is to use a basic SET/Get command in the PCC and add a bunch of zeroes to make the frame last longer so the AEM will accurately capture the current. Zoom up the AEM to see the frame. Unscrew the antenna or just shut the ED off and send again and as the TxPower is increased, the current goes DOWN. There are 3 tries = -6=38.79mA, -3=38.05mA then 0=10.41mA. Send again for 3 more tries = 0=10.42mA, 3=12.05mA, 6=14.22mA. Send again = 6=</w:t>
+        <w:t xml:space="preserve">is 37.97mA. </w:t>
+      </w:r>
+      <w:r>
+        <w:lastRenderedPageBreak/>
+        <w:t>The easy way to see the frame is to use a basic SET/Get command in the PCC and add a bunch of zeroes to make the frame last longer so the AEM will accurately capture the current. Zoom up the AEM to see the frame. Unscrew the antenna or just shut the ED off and send again and as the TxPower is increased, the current goes DOWN. There are 3 tries = -6=38.79mA, -3=38.05mA then 0=10.41mA. Send again for 3 more tries = 0=10.42mA, 3=12.05mA, 6=14.22mA. Send again = 6=</w:t>
       </w:r>
       <w:r>
         <w:t>14.21mA</w:t>
@@ -6944,7 +6996,6 @@
     </w:p>
     <w:p>
       <w:r>
-        <w:lastRenderedPageBreak/>
         <w:t>But why am I getting Z-Wave Mesh to have similar or even slightly better RF Range than ZWLR?</w:t>
       </w:r>
     </w:p>
@@ -7183,6 +7234,7 @@
     </w:p>
     <w:p>
       <w:r>
+        <w:lastRenderedPageBreak/>
         <w:t xml:space="preserve">These will all be tested by connecting to a ZRADMini with ANT-916-CW-RH-SMA which is a tiny and pretty terrible antenna. </w:t>
       </w:r>
       <w:r>
@@ -7245,7 +7297,6 @@
           </w:tcPr>
           <w:p>
             <w:r>
-              <w:lastRenderedPageBreak/>
               <w:t>S0</w:t>
             </w:r>
           </w:p>
@@ -8068,6 +8119,7 @@
         </w:numPr>
       </w:pPr>
       <w:r>
+        <w:lastRenderedPageBreak/>
         <w:t>To add a buzzer to ZRADMini:</w:t>
       </w:r>
     </w:p>
@@ -8223,7 +8275,6 @@
         </w:numPr>
       </w:pPr>
       <w:r>
-        <w:lastRenderedPageBreak/>
         <w:t>Use a PWM to drive PD02 at the resonant frequency of the buzzer to get the beep and a timer to enable it for a fraction of a second</w:t>
       </w:r>
     </w:p>
@@ -8440,7 +8491,14 @@
         <w:rPr>
           <w:noProof/>
         </w:rPr>
-        <w:t>The first 4 can be ignored and are caused by adding a via to the USB shield pads which provides additional mechanical strength making it harder to rip the pads off the PCB when plugging/unplugging the USB connector. The 5</w:t>
+        <w:t xml:space="preserve">The first 4 can be ignored and are caused by adding a via to the USB shield pads which provides additional mechanical strength making it harder to rip the pads off the PCB when </w:t>
+      </w:r>
+      <w:r>
+        <w:rPr>
+          <w:noProof/>
+        </w:rPr>
+        <w:lastRenderedPageBreak/>
+        <w:t>plugging/unplugging the USB connector. The 5</w:t>
       </w:r>
       <w:r>
         <w:rPr>
@@ -8476,7 +8534,6 @@
     </w:p>
     <w:p>
       <w:r>
-        <w:lastRenderedPageBreak/>
         <w:t>Main problem is that board #2 CZ20 didn’t solder very well at all. Seems to have lifted slightly especially on one side. Many of the pins had no solder on the pad – where did it go? Did the EP suck it all in</w:t>
       </w:r>
       <w:r>
@@ -8764,6 +8821,7 @@
         </w:numPr>
       </w:pPr>
       <w:r>
+        <w:lastRenderedPageBreak/>
         <w:t>Code compiles and it seems the PWM is initialized but no sound.</w:t>
       </w:r>
     </w:p>
@@ -8827,7 +8885,6 @@
         </w:numPr>
       </w:pPr>
       <w:r>
-        <w:lastRenderedPageBreak/>
         <w:t>It’s easier to just directly write the registers than try to figure this out!</w:t>
       </w:r>
     </w:p>
@@ -9482,7 +9539,11 @@
         <w:t xml:space="preserve">error </w:t>
       </w:r>
       <w:r>
-        <w:t>exclusions. The 2 Fudicial marks, 4 vias with one connection on the USB SMD mounting pads, the U.FL connector doesn’t match the one in the library which has several DRC errors in it, CZ20 footprint in the library has .2mm vias in the EP but the minimum allowed is .254 so I had to manually increase those.</w:t>
+        <w:t xml:space="preserve">exclusions. The 2 Fudicial marks, 4 vias with one connection on the USB SMD mounting pads, the U.FL connector doesn’t match the one in the library which has several DRC errors in it, CZ20 footprint </w:t>
+      </w:r>
+      <w:r>
+        <w:lastRenderedPageBreak/>
+        <w:t>in the library has .2mm vias in the EP but the minimum allowed is .254 so I had to manually increase those.</w:t>
       </w:r>
       <w:r>
         <w:t xml:space="preserve"> Ordered 9 PCBs and a metal stencil.</w:t>
@@ -9509,7 +9570,6 @@
         <w:pStyle w:val="Heading2"/>
       </w:pPr>
       <w:r>
-        <w:lastRenderedPageBreak/>
         <w:t>2025-04-11 – Trident Schematic</w:t>
       </w:r>
     </w:p>
@@ -9756,7 +9816,11 @@
         <w:t>has similar RF range</w:t>
       </w:r>
       <w:r>
-        <w:t xml:space="preserve"> to ZRAD to avoid bringing the large ZRAD to Barcelona. </w:t>
+        <w:t xml:space="preserve"> to ZRAD to avoid bringing the large ZRAD to </w:t>
+      </w:r>
+      <w:r>
+        <w:lastRenderedPageBreak/>
+        <w:t xml:space="preserve">Barcelona. </w:t>
       </w:r>
       <w:r>
         <w:t>Spent most of the day but have 1 ZRM with an SMA antenna and GeoLoc, 1 with SwOnOff PCB antenna, a TBZ with SwOnOff connected thru a USB hub powered by my Anker brick.</w:t>
@@ -9783,11 +9847,7 @@
     </w:p>
     <w:p>
       <w:r>
-        <w:t xml:space="preserve">Trying to install I2CSPM into my project with keys so I can OTA. But installing I2CSPM says it need IO Stream but then fails. The docs say there are no dependencies but clearly there are. Installing I2CSPM is not configurable so clearly </w:t>
-      </w:r>
-      <w:r>
-        <w:lastRenderedPageBreak/>
-        <w:t>something isn’t working. Uninstalling then gives a Validation Error. Previously I had always enabled DEBUGPRINT so let’s try that.</w:t>
+        <w:t>Trying to install I2CSPM into my project with keys so I can OTA. But installing I2CSPM says it need IO Stream but then fails. The docs say there are no dependencies but clearly there are. Installing I2CSPM is not configurable so clearly something isn’t working. Uninstalling then gives a Validation Error. Previously I had always enabled DEBUGPRINT so let’s try that.</w:t>
       </w:r>
       <w:r>
         <w:t xml:space="preserve"> Nope that doesn’t work. DebugPrint doesn’t install the IO Stream. I reverted back to my older project that has geoloc in it but no keys. Not sure what the difference is but as usual SSv5 makes it impossible to move forward so instead I move backward. I need to get the javascript program pulling more than 1 DUT today.</w:t>
@@ -9916,7 +9976,11 @@
         <w:t xml:space="preserve"> #2 Zniffer works when connected thru the WSTK to COM4 but not straight thru the USB. Doesn’t work with the PC Controller either. Maybe the USB doesn’t work on board 2 and board 3?</w:t>
       </w:r>
       <w:r>
-        <w:t xml:space="preserve"> AHA! The first via on board 2 from R7 (VCOMRX) was open. Looked OK but was not making contact thru the PCB. I stuffed a wire thru the via and soldered it in place and now it’s a Zniffer via USB. Perhaps board 3 has the same problem? That via is a standard via on .1mm center so it’s just a manufacturing defect. Maybe I will make this via a little larger if board 3 has the same problem.</w:t>
+        <w:t xml:space="preserve"> AHA! The first via on board 2 from R7 (VCOMRX) was open. </w:t>
+      </w:r>
+      <w:r>
+        <w:lastRenderedPageBreak/>
+        <w:t>Looked OK but was not making contact thru the PCB. I stuffed a wire thru the via and soldered it in place and now it’s a Zniffer via USB. Perhaps board 3 has the same problem? That via is a standard via on .1mm center so it’s just a manufacturing defect. Maybe I will make this via a little larger if board 3 has the same problem.</w:t>
       </w:r>
       <w:r>
         <w:t xml:space="preserve"> No, board 3 has a different problem – the CP2102 doesn’t seem to respond at all.</w:t>
@@ -9950,7 +10014,6 @@
         <w:pStyle w:val="Heading2"/>
       </w:pPr>
       <w:r>
-        <w:lastRenderedPageBreak/>
         <w:t>2025-01-03 – Test program development</w:t>
       </w:r>
     </w:p>
@@ -12031,7 +12094,7 @@
           <w:noProof/>
         </w:rPr>
         <w:drawing>
-          <wp:anchor distT="0" distB="0" distL="114300" distR="114300" simplePos="0" relativeHeight="251699200" behindDoc="0" locked="0" layoutInCell="1" allowOverlap="0" wp14:anchorId="3BFCC50E" wp14:editId="7B8A7EE2">
+          <wp:anchor distT="0" distB="0" distL="114300" distR="114300" simplePos="0" relativeHeight="251699200" behindDoc="0" locked="0" layoutInCell="1" allowOverlap="0" wp14:anchorId="3BFCC50E" wp14:editId="5B78875D">
             <wp:simplePos x="457200" y="2247900"/>
             <wp:positionH relativeFrom="column">
               <wp:align>right</wp:align>
@@ -23201,7 +23264,7 @@
 </file>
 
 <file path=word/endnotes.xml><?xml version="1.0" encoding="utf-8"?>
-<w:endnotes xmlns:wpc="http://schemas.microsoft.com/office/word/2010/wordprocessingCanvas" xmlns:cx="http://schemas.microsoft.com/office/drawing/2014/chartex" xmlns:cx1="http://schemas.microsoft.com/office/drawing/2015/9/8/chartex" xmlns:cx2="http://schemas.microsoft.com/office/drawing/2015/10/21/chartex" xmlns:cx3="http://schemas.microsoft.com/office/drawing/2016/5/9/chartex" xmlns:cx4="http://schemas.microsoft.com/office/drawing/2016/5/10/chartex" xmlns:cx5="http://schemas.microsoft.com/office/drawing/2016/5/11/chartex" xmlns:cx6="http://schemas.microsoft.com/office/drawing/2016/5/12/chartex" xmlns:cx7="http://schemas.microsoft.com/office/drawing/2016/5/13/chartex" xmlns:cx8="http://schemas.microsoft.com/office/drawing/2016/5/14/chartex" xmlns:mc="http://schemas.openxmlformats.org/markup-compatibility/2006" xmlns:aink="http://schemas.microsoft.com/office/drawing/2016/ink" xmlns:am3d="http://schemas.microsoft.com/office/drawing/2017/model3d" xmlns:o="urn:schemas-microsoft-com:office:office" xmlns:oel="http://schemas.microsoft.com/office/2019/extlst" xmlns:r="http://schemas.openxmlformats.org/officeDocument/2006/relationships" xmlns:m="http://schemas.openxmlformats.org/officeDocument/2006/math" xmlns:v="urn:schemas-microsoft-com:vml" xmlns:wp14="http://schemas.microsoft.com/office/word/2010/wordprocessingDrawing" xmlns:wp="http://schemas.openxmlformats.org/drawingml/2006/wordprocessingDrawing" xmlns:w10="urn:schemas-microsoft-com:office:word" xmlns:w="http://schemas.openxmlformats.org/wordprocessingml/2006/main" xmlns:w14="http://schemas.microsoft.com/office/word/2010/wordml" xmlns:w15="http://schemas.microsoft.com/office/word/2012/wordml" xmlns:w16cex="http://schemas.microsoft.com/office/word/2018/wordml/cex" xmlns:w16cid="http://schemas.microsoft.com/office/word/2016/wordml/cid" xmlns:w16="http://schemas.microsoft.com/office/word/2018/wordml" xmlns:w16du="http://schemas.microsoft.com/office/word/2023/wordml/word16du" xmlns:w16sdtdh="http://schemas.microsoft.com/office/word/2020/wordml/sdtdatahash" xmlns:w16sdtfl="http://schemas.microsoft.com/office/word/2024/wordml/sdtformatlock" xmlns:w16se="http://schemas.microsoft.com/office/word/2015/wordml/symex" xmlns:wpg="http://schemas.microsoft.com/office/word/2010/wordprocessingGroup" xmlns:wpi="http://schemas.microsoft.com/office/word/2010/wordprocessingInk" xmlns:wne="http://schemas.microsoft.com/office/word/2006/wordml" xmlns:wps="http://schemas.microsoft.com/office/word/2010/wordprocessingShape" mc:Ignorable="w14 w15 w16se w16cid w16 w16cex w16sdtdh w16sdtfl w16du wp14">
+<w:endnotes xmlns:wpc="http://schemas.microsoft.com/office/word/2010/wordprocessingCanvas" xmlns:cx="http://schemas.microsoft.com/office/drawing/2014/chartex" xmlns:cx1="http://schemas.microsoft.com/office/drawing/2015/9/8/chartex" xmlns:cx2="http://schemas.microsoft.com/office/drawing/2015/10/21/chartex" xmlns:cx3="http://schemas.microsoft.com/office/drawing/2016/5/9/chartex" xmlns:cx4="http://schemas.microsoft.com/office/drawing/2016/5/10/chartex" xmlns:cx5="http://schemas.microsoft.com/office/drawing/2016/5/11/chartex" xmlns:cx6="http://schemas.microsoft.com/office/drawing/2016/5/12/chartex" xmlns:cx7="http://schemas.microsoft.com/office/drawing/2016/5/13/chartex" xmlns:cx8="http://schemas.microsoft.com/office/drawing/2016/5/14/chartex" xmlns:mc="http://schemas.openxmlformats.org/markup-compatibility/2006" xmlns:aink="http://schemas.microsoft.com/office/drawing/2016/ink" xmlns:am3d="http://schemas.microsoft.com/office/drawing/2017/model3d" xmlns:o="urn:schemas-microsoft-com:office:office" xmlns:oel="http://schemas.microsoft.com/office/2019/extlst" xmlns:r="http://schemas.openxmlformats.org/officeDocument/2006/relationships" xmlns:m="http://schemas.openxmlformats.org/officeDocument/2006/math" xmlns:v="urn:schemas-microsoft-com:vml" xmlns:wp14="http://schemas.microsoft.com/office/word/2010/wordprocessingDrawing" xmlns:wp="http://schemas.openxmlformats.org/drawingml/2006/wordprocessingDrawing" xmlns:w10="urn:schemas-microsoft-com:office:word" xmlns:w="http://schemas.openxmlformats.org/wordprocessingml/2006/main" xmlns:w14="http://schemas.microsoft.com/office/word/2010/wordml" xmlns:w15="http://schemas.microsoft.com/office/word/2012/wordml" xmlns:w16cei="http://schemas.microsoft.com/office/word/2026/wordml/cei" xmlns:w16cex="http://schemas.microsoft.com/office/word/2018/wordml/cex" xmlns:w16cid="http://schemas.microsoft.com/office/word/2016/wordml/cid" xmlns:w16="http://schemas.microsoft.com/office/word/2018/wordml" xmlns:w16du="http://schemas.microsoft.com/office/word/2023/wordml/word16du" xmlns:w16sdtdh="http://schemas.microsoft.com/office/word/2020/wordml/sdtdatahash" xmlns:w16sdtfl="http://schemas.microsoft.com/office/word/2024/wordml/sdtformatlock" xmlns:w16se="http://schemas.microsoft.com/office/word/2015/wordml/symex" xmlns:wpg="http://schemas.microsoft.com/office/word/2010/wordprocessingGroup" xmlns:wpi="http://schemas.microsoft.com/office/word/2010/wordprocessingInk" xmlns:wne="http://schemas.microsoft.com/office/word/2006/wordml" xmlns:wps="http://schemas.microsoft.com/office/word/2010/wordprocessingShape" mc:Ignorable="w14 w15 w16se w16cid w16 w16cex w16sdtdh w16sdtfl w16du wp14">
   <w:endnote w:type="separator" w:id="-1">
     <w:p>
       <w:pPr>
@@ -23226,7 +23289,7 @@
 </file>
 
 <file path=word/footer1.xml><?xml version="1.0" encoding="utf-8"?>
-<w:ftr xmlns:wpc="http://schemas.microsoft.com/office/word/2010/wordprocessingCanvas" xmlns:cx="http://schemas.microsoft.com/office/drawing/2014/chartex" xmlns:cx1="http://schemas.microsoft.com/office/drawing/2015/9/8/chartex" xmlns:cx2="http://schemas.microsoft.com/office/drawing/2015/10/21/chartex" xmlns:cx3="http://schemas.microsoft.com/office/drawing/2016/5/9/chartex" xmlns:cx4="http://schemas.microsoft.com/office/drawing/2016/5/10/chartex" xmlns:cx5="http://schemas.microsoft.com/office/drawing/2016/5/11/chartex" xmlns:cx6="http://schemas.microsoft.com/office/drawing/2016/5/12/chartex" xmlns:cx7="http://schemas.microsoft.com/office/drawing/2016/5/13/chartex" xmlns:cx8="http://schemas.microsoft.com/office/drawing/2016/5/14/chartex" xmlns:mc="http://schemas.openxmlformats.org/markup-compatibility/2006" xmlns:aink="http://schemas.microsoft.com/office/drawing/2016/ink" xmlns:am3d="http://schemas.microsoft.com/office/drawing/2017/model3d" xmlns:o="urn:schemas-microsoft-com:office:office" xmlns:oel="http://schemas.microsoft.com/office/2019/extlst" xmlns:r="http://schemas.openxmlformats.org/officeDocument/2006/relationships" xmlns:m="http://schemas.openxmlformats.org/officeDocument/2006/math" xmlns:v="urn:schemas-microsoft-com:vml" xmlns:wp14="http://schemas.microsoft.com/office/word/2010/wordprocessingDrawing" xmlns:wp="http://schemas.openxmlformats.org/drawingml/2006/wordprocessingDrawing" xmlns:w10="urn:schemas-microsoft-com:office:word" xmlns:w="http://schemas.openxmlformats.org/wordprocessingml/2006/main" xmlns:w14="http://schemas.microsoft.com/office/word/2010/wordml" xmlns:w15="http://schemas.microsoft.com/office/word/2012/wordml" xmlns:w16cex="http://schemas.microsoft.com/office/word/2018/wordml/cex" xmlns:w16cid="http://schemas.microsoft.com/office/word/2016/wordml/cid" xmlns:w16="http://schemas.microsoft.com/office/word/2018/wordml" xmlns:w16du="http://schemas.microsoft.com/office/word/2023/wordml/word16du" xmlns:w16sdtdh="http://schemas.microsoft.com/office/word/2020/wordml/sdtdatahash" xmlns:w16sdtfl="http://schemas.microsoft.com/office/word/2024/wordml/sdtformatlock" xmlns:w16se="http://schemas.microsoft.com/office/word/2015/wordml/symex" xmlns:wpg="http://schemas.microsoft.com/office/word/2010/wordprocessingGroup" xmlns:wpi="http://schemas.microsoft.com/office/word/2010/wordprocessingInk" xmlns:wne="http://schemas.microsoft.com/office/word/2006/wordml" xmlns:wps="http://schemas.microsoft.com/office/word/2010/wordprocessingShape" mc:Ignorable="w14 w15 w16se w16cid w16 w16cex w16sdtdh w16sdtfl w16du wp14">
+<w:ftr xmlns:wpc="http://schemas.microsoft.com/office/word/2010/wordprocessingCanvas" xmlns:cx="http://schemas.microsoft.com/office/drawing/2014/chartex" xmlns:cx1="http://schemas.microsoft.com/office/drawing/2015/9/8/chartex" xmlns:cx2="http://schemas.microsoft.com/office/drawing/2015/10/21/chartex" xmlns:cx3="http://schemas.microsoft.com/office/drawing/2016/5/9/chartex" xmlns:cx4="http://schemas.microsoft.com/office/drawing/2016/5/10/chartex" xmlns:cx5="http://schemas.microsoft.com/office/drawing/2016/5/11/chartex" xmlns:cx6="http://schemas.microsoft.com/office/drawing/2016/5/12/chartex" xmlns:cx7="http://schemas.microsoft.com/office/drawing/2016/5/13/chartex" xmlns:cx8="http://schemas.microsoft.com/office/drawing/2016/5/14/chartex" xmlns:mc="http://schemas.openxmlformats.org/markup-compatibility/2006" xmlns:aink="http://schemas.microsoft.com/office/drawing/2016/ink" xmlns:am3d="http://schemas.microsoft.com/office/drawing/2017/model3d" xmlns:o="urn:schemas-microsoft-com:office:office" xmlns:oel="http://schemas.microsoft.com/office/2019/extlst" xmlns:r="http://schemas.openxmlformats.org/officeDocument/2006/relationships" xmlns:m="http://schemas.openxmlformats.org/officeDocument/2006/math" xmlns:v="urn:schemas-microsoft-com:vml" xmlns:wp14="http://schemas.microsoft.com/office/word/2010/wordprocessingDrawing" xmlns:wp="http://schemas.openxmlformats.org/drawingml/2006/wordprocessingDrawing" xmlns:w10="urn:schemas-microsoft-com:office:word" xmlns:w="http://schemas.openxmlformats.org/wordprocessingml/2006/main" xmlns:w14="http://schemas.microsoft.com/office/word/2010/wordml" xmlns:w15="http://schemas.microsoft.com/office/word/2012/wordml" xmlns:w16cei="http://schemas.microsoft.com/office/word/2026/wordml/cei" xmlns:w16cex="http://schemas.microsoft.com/office/word/2018/wordml/cex" xmlns:w16cid="http://schemas.microsoft.com/office/word/2016/wordml/cid" xmlns:w16="http://schemas.microsoft.com/office/word/2018/wordml" xmlns:w16du="http://schemas.microsoft.com/office/word/2023/wordml/word16du" xmlns:w16sdtdh="http://schemas.microsoft.com/office/word/2020/wordml/sdtdatahash" xmlns:w16sdtfl="http://schemas.microsoft.com/office/word/2024/wordml/sdtformatlock" xmlns:w16se="http://schemas.microsoft.com/office/word/2015/wordml/symex" xmlns:wpg="http://schemas.microsoft.com/office/word/2010/wordprocessingGroup" xmlns:wpi="http://schemas.microsoft.com/office/word/2010/wordprocessingInk" xmlns:wne="http://schemas.microsoft.com/office/word/2006/wordml" xmlns:wps="http://schemas.microsoft.com/office/word/2010/wordprocessingShape" mc:Ignorable="w14 w15 w16se w16cid w16 w16cex w16sdtdh w16sdtfl w16du wp14">
   <w:p>
     <w:pPr>
       <w:pStyle w:val="Footer"/>
@@ -23288,7 +23351,7 @@
 </file>
 
 <file path=word/footnotes.xml><?xml version="1.0" encoding="utf-8"?>
-<w:footnotes xmlns:wpc="http://schemas.microsoft.com/office/word/2010/wordprocessingCanvas" xmlns:cx="http://schemas.microsoft.com/office/drawing/2014/chartex" xmlns:cx1="http://schemas.microsoft.com/office/drawing/2015/9/8/chartex" xmlns:cx2="http://schemas.microsoft.com/office/drawing/2015/10/21/chartex" xmlns:cx3="http://schemas.microsoft.com/office/drawing/2016/5/9/chartex" xmlns:cx4="http://schemas.microsoft.com/office/drawing/2016/5/10/chartex" xmlns:cx5="http://schemas.microsoft.com/office/drawing/2016/5/11/chartex" xmlns:cx6="http://schemas.microsoft.com/office/drawing/2016/5/12/chartex" xmlns:cx7="http://schemas.microsoft.com/office/drawing/2016/5/13/chartex" xmlns:cx8="http://schemas.microsoft.com/office/drawing/2016/5/14/chartex" xmlns:mc="http://schemas.openxmlformats.org/markup-compatibility/2006" xmlns:aink="http://schemas.microsoft.com/office/drawing/2016/ink" xmlns:am3d="http://schemas.microsoft.com/office/drawing/2017/model3d" xmlns:o="urn:schemas-microsoft-com:office:office" xmlns:oel="http://schemas.microsoft.com/office/2019/extlst" xmlns:r="http://schemas.openxmlformats.org/officeDocument/2006/relationships" xmlns:m="http://schemas.openxmlformats.org/officeDocument/2006/math" xmlns:v="urn:schemas-microsoft-com:vml" xmlns:wp14="http://schemas.microsoft.com/office/word/2010/wordprocessingDrawing" xmlns:wp="http://schemas.openxmlformats.org/drawingml/2006/wordprocessingDrawing" xmlns:w10="urn:schemas-microsoft-com:office:word" xmlns:w="http://schemas.openxmlformats.org/wordprocessingml/2006/main" xmlns:w14="http://schemas.microsoft.com/office/word/2010/wordml" xmlns:w15="http://schemas.microsoft.com/office/word/2012/wordml" xmlns:w16cex="http://schemas.microsoft.com/office/word/2018/wordml/cex" xmlns:w16cid="http://schemas.microsoft.com/office/word/2016/wordml/cid" xmlns:w16="http://schemas.microsoft.com/office/word/2018/wordml" xmlns:w16du="http://schemas.microsoft.com/office/word/2023/wordml/word16du" xmlns:w16sdtdh="http://schemas.microsoft.com/office/word/2020/wordml/sdtdatahash" xmlns:w16sdtfl="http://schemas.microsoft.com/office/word/2024/wordml/sdtformatlock" xmlns:w16se="http://schemas.microsoft.com/office/word/2015/wordml/symex" xmlns:wpg="http://schemas.microsoft.com/office/word/2010/wordprocessingGroup" xmlns:wpi="http://schemas.microsoft.com/office/word/2010/wordprocessingInk" xmlns:wne="http://schemas.microsoft.com/office/word/2006/wordml" xmlns:wps="http://schemas.microsoft.com/office/word/2010/wordprocessingShape" mc:Ignorable="w14 w15 w16se w16cid w16 w16cex w16sdtdh w16sdtfl w16du wp14">
+<w:footnotes xmlns:wpc="http://schemas.microsoft.com/office/word/2010/wordprocessingCanvas" xmlns:cx="http://schemas.microsoft.com/office/drawing/2014/chartex" xmlns:cx1="http://schemas.microsoft.com/office/drawing/2015/9/8/chartex" xmlns:cx2="http://schemas.microsoft.com/office/drawing/2015/10/21/chartex" xmlns:cx3="http://schemas.microsoft.com/office/drawing/2016/5/9/chartex" xmlns:cx4="http://schemas.microsoft.com/office/drawing/2016/5/10/chartex" xmlns:cx5="http://schemas.microsoft.com/office/drawing/2016/5/11/chartex" xmlns:cx6="http://schemas.microsoft.com/office/drawing/2016/5/12/chartex" xmlns:cx7="http://schemas.microsoft.com/office/drawing/2016/5/13/chartex" xmlns:cx8="http://schemas.microsoft.com/office/drawing/2016/5/14/chartex" xmlns:mc="http://schemas.openxmlformats.org/markup-compatibility/2006" xmlns:aink="http://schemas.microsoft.com/office/drawing/2016/ink" xmlns:am3d="http://schemas.microsoft.com/office/drawing/2017/model3d" xmlns:o="urn:schemas-microsoft-com:office:office" xmlns:oel="http://schemas.microsoft.com/office/2019/extlst" xmlns:r="http://schemas.openxmlformats.org/officeDocument/2006/relationships" xmlns:m="http://schemas.openxmlformats.org/officeDocument/2006/math" xmlns:v="urn:schemas-microsoft-com:vml" xmlns:wp14="http://schemas.microsoft.com/office/word/2010/wordprocessingDrawing" xmlns:wp="http://schemas.openxmlformats.org/drawingml/2006/wordprocessingDrawing" xmlns:w10="urn:schemas-microsoft-com:office:word" xmlns:w="http://schemas.openxmlformats.org/wordprocessingml/2006/main" xmlns:w14="http://schemas.microsoft.com/office/word/2010/wordml" xmlns:w15="http://schemas.microsoft.com/office/word/2012/wordml" xmlns:w16cei="http://schemas.microsoft.com/office/word/2026/wordml/cei" xmlns:w16cex="http://schemas.microsoft.com/office/word/2018/wordml/cex" xmlns:w16cid="http://schemas.microsoft.com/office/word/2016/wordml/cid" xmlns:w16="http://schemas.microsoft.com/office/word/2018/wordml" xmlns:w16du="http://schemas.microsoft.com/office/word/2023/wordml/word16du" xmlns:w16sdtdh="http://schemas.microsoft.com/office/word/2020/wordml/sdtdatahash" xmlns:w16sdtfl="http://schemas.microsoft.com/office/word/2024/wordml/sdtformatlock" xmlns:w16se="http://schemas.microsoft.com/office/word/2015/wordml/symex" xmlns:wpg="http://schemas.microsoft.com/office/word/2010/wordprocessingGroup" xmlns:wpi="http://schemas.microsoft.com/office/word/2010/wordprocessingInk" xmlns:wne="http://schemas.microsoft.com/office/word/2006/wordml" xmlns:wps="http://schemas.microsoft.com/office/word/2010/wordprocessingShape" mc:Ignorable="w14 w15 w16se w16cid w16 w16cex w16sdtdh w16sdtfl w16du wp14">
   <w:footnote w:type="separator" w:id="-1">
     <w:p>
       <w:pPr>
@@ -23313,7 +23376,7 @@
 </file>
 
 <file path=word/numbering.xml><?xml version="1.0" encoding="utf-8"?>
-<w:numbering xmlns:wpc="http://schemas.microsoft.com/office/word/2010/wordprocessingCanvas" xmlns:cx="http://schemas.microsoft.com/office/drawing/2014/chartex" xmlns:cx1="http://schemas.microsoft.com/office/drawing/2015/9/8/chartex" xmlns:cx2="http://schemas.microsoft.com/office/drawing/2015/10/21/chartex" xmlns:cx3="http://schemas.microsoft.com/office/drawing/2016/5/9/chartex" xmlns:cx4="http://schemas.microsoft.com/office/drawing/2016/5/10/chartex" xmlns:cx5="http://schemas.microsoft.com/office/drawing/2016/5/11/chartex" xmlns:cx6="http://schemas.microsoft.com/office/drawing/2016/5/12/chartex" xmlns:cx7="http://schemas.microsoft.com/office/drawing/2016/5/13/chartex" xmlns:cx8="http://schemas.microsoft.com/office/drawing/2016/5/14/chartex" xmlns:mc="http://schemas.openxmlformats.org/markup-compatibility/2006" xmlns:aink="http://schemas.microsoft.com/office/drawing/2016/ink" xmlns:am3d="http://schemas.microsoft.com/office/drawing/2017/model3d" xmlns:o="urn:schemas-microsoft-com:office:office" xmlns:oel="http://schemas.microsoft.com/office/2019/extlst" xmlns:r="http://schemas.openxmlformats.org/officeDocument/2006/relationships" xmlns:m="http://schemas.openxmlformats.org/officeDocument/2006/math" xmlns:v="urn:schemas-microsoft-com:vml" xmlns:wp14="http://schemas.microsoft.com/office/word/2010/wordprocessingDrawing" xmlns:wp="http://schemas.openxmlformats.org/drawingml/2006/wordprocessingDrawing" xmlns:w10="urn:schemas-microsoft-com:office:word" xmlns:w="http://schemas.openxmlformats.org/wordprocessingml/2006/main" xmlns:w14="http://schemas.microsoft.com/office/word/2010/wordml" xmlns:w15="http://schemas.microsoft.com/office/word/2012/wordml" xmlns:w16cex="http://schemas.microsoft.com/office/word/2018/wordml/cex" xmlns:w16cid="http://schemas.microsoft.com/office/word/2016/wordml/cid" xmlns:w16="http://schemas.microsoft.com/office/word/2018/wordml" xmlns:w16du="http://schemas.microsoft.com/office/word/2023/wordml/word16du" xmlns:w16sdtdh="http://schemas.microsoft.com/office/word/2020/wordml/sdtdatahash" xmlns:w16sdtfl="http://schemas.microsoft.com/office/word/2024/wordml/sdtformatlock" xmlns:w16se="http://schemas.microsoft.com/office/word/2015/wordml/symex" xmlns:wpg="http://schemas.microsoft.com/office/word/2010/wordprocessingGroup" xmlns:wpi="http://schemas.microsoft.com/office/word/2010/wordprocessingInk" xmlns:wne="http://schemas.microsoft.com/office/word/2006/wordml" xmlns:wps="http://schemas.microsoft.com/office/word/2010/wordprocessingShape" mc:Ignorable="w14 w15 w16se w16cid w16 w16cex w16sdtdh w16sdtfl w16du wp14">
+<w:numbering xmlns:wpc="http://schemas.microsoft.com/office/word/2010/wordprocessingCanvas" xmlns:cx="http://schemas.microsoft.com/office/drawing/2014/chartex" xmlns:cx1="http://schemas.microsoft.com/office/drawing/2015/9/8/chartex" xmlns:cx2="http://schemas.microsoft.com/office/drawing/2015/10/21/chartex" xmlns:cx3="http://schemas.microsoft.com/office/drawing/2016/5/9/chartex" xmlns:cx4="http://schemas.microsoft.com/office/drawing/2016/5/10/chartex" xmlns:cx5="http://schemas.microsoft.com/office/drawing/2016/5/11/chartex" xmlns:cx6="http://schemas.microsoft.com/office/drawing/2016/5/12/chartex" xmlns:cx7="http://schemas.microsoft.com/office/drawing/2016/5/13/chartex" xmlns:cx8="http://schemas.microsoft.com/office/drawing/2016/5/14/chartex" xmlns:mc="http://schemas.openxmlformats.org/markup-compatibility/2006" xmlns:aink="http://schemas.microsoft.com/office/drawing/2016/ink" xmlns:am3d="http://schemas.microsoft.com/office/drawing/2017/model3d" xmlns:o="urn:schemas-microsoft-com:office:office" xmlns:oel="http://schemas.microsoft.com/office/2019/extlst" xmlns:r="http://schemas.openxmlformats.org/officeDocument/2006/relationships" xmlns:m="http://schemas.openxmlformats.org/officeDocument/2006/math" xmlns:v="urn:schemas-microsoft-com:vml" xmlns:wp14="http://schemas.microsoft.com/office/word/2010/wordprocessingDrawing" xmlns:wp="http://schemas.openxmlformats.org/drawingml/2006/wordprocessingDrawing" xmlns:w10="urn:schemas-microsoft-com:office:word" xmlns:w="http://schemas.openxmlformats.org/wordprocessingml/2006/main" xmlns:w14="http://schemas.microsoft.com/office/word/2010/wordml" xmlns:w15="http://schemas.microsoft.com/office/word/2012/wordml" xmlns:w16cei="http://schemas.microsoft.com/office/word/2026/wordml/cei" xmlns:w16cex="http://schemas.microsoft.com/office/word/2018/wordml/cex" xmlns:w16cid="http://schemas.microsoft.com/office/word/2016/wordml/cid" xmlns:w16="http://schemas.microsoft.com/office/word/2018/wordml" xmlns:w16du="http://schemas.microsoft.com/office/word/2023/wordml/word16du" xmlns:w16sdtdh="http://schemas.microsoft.com/office/word/2020/wordml/sdtdatahash" xmlns:w16sdtfl="http://schemas.microsoft.com/office/word/2024/wordml/sdtformatlock" xmlns:w16se="http://schemas.microsoft.com/office/word/2015/wordml/symex" xmlns:wpg="http://schemas.microsoft.com/office/word/2010/wordprocessingGroup" xmlns:wpi="http://schemas.microsoft.com/office/word/2010/wordprocessingInk" xmlns:wne="http://schemas.microsoft.com/office/word/2006/wordml" xmlns:wps="http://schemas.microsoft.com/office/word/2010/wordprocessingShape" mc:Ignorable="w14 w15 w16se w16cid w16 w16cex w16sdtdh w16sdtfl w16du wp14">
   <w:abstractNum w:abstractNumId="0" w15:restartNumberingAfterBreak="0">
     <w:nsid w:val="0B03153E"/>
     <w:multiLevelType w:val="hybridMultilevel"/>

</xml_diff>